<commit_message>
docs(manual): complete 4-AI review (kimi 22/22) + apply operator deltas
- add kimi R1 reviews for operator 03·04·05·07·08·09·10·11 (kimi 14/22 -> 22/22)
- re-synthesize those 8 operator 종합_R1 with 4 AIs (codex·claude·agy·kimi)
- apply code-verified deltas to operator chapters 05·07·09·11:
  - 07: correct stale model — runtimeLoad/unload (not process spawn/kill),
        DevicesView screen, real manager-settings fields, drop fictional backoff
  - 05: TCP 2004 port, admin 8-value immediate PLC write, servo mm/0.1mm units
  - 09: backup verification + recipe restore steps
  - 11: console/AgentUI/Manager log paths, retention counts, AgentUI files
- 03·04·08·10 already reflected consensus (no chapter change)
- regenerate user/operator docx
</commit_message>
<xml_diff>
--- a/docs/manual/HeatingCameraSystem_운영자매뉴얼.docx
+++ b/docs/manual/HeatingCameraSystem_운영자매뉴얼.docx
@@ -11650,7 +11650,7 @@
           <w:rFonts w:ascii="맑은 고딕" w:hAnsi="맑은 고딕" w:eastAsia="맑은 고딕"/>
           <w:sz w:val="21"/>
         </w:rPr>
-        <w:t>PLC 연결: IP 주소·포트·국번(Station) → 저장. 설정은 hardware.json에 저장되며 프로그램 재시작 후 적용된다.</w:t>
+        <w:t>PLC 연결: IP 주소·포트·국번(Station) → 저장. 기본 포트는 LS XGT FEnet용 TCP 2004. 설정은 hardware.json에 저장되며 프로그램 재시작 후 적용된다.</w:t>
       </w:r>
     </w:p>
     <w:p>
@@ -11674,7 +11674,7 @@
           <w:rFonts w:ascii="맑은 고딕" w:hAnsi="맑은 고딕" w:eastAsia="맑은 고딕"/>
           <w:sz w:val="21"/>
         </w:rPr>
-        <w:t>흑체 목표 온도: 흑체 1·2의 목표 온도 입력 → 적용</w:t>
+        <w:t>흑체 목표 온도: 흑체 1·2의 목표 온도 입력 → 적용(흑체 컨트롤러에 즉시 전달)</w:t>
       </w:r>
     </w:p>
     <w:p>
@@ -11686,7 +11686,7 @@
           <w:rFonts w:ascii="맑은 고딕" w:hAnsi="맑은 고딕" w:eastAsia="맑은 고딕"/>
           <w:sz w:val="21"/>
         </w:rPr>
-        <w:t>관리자 설정: 과열 상한·상온/2차 냉동기 경계·냉동기 딜레이·바이패스 경계·MFC 최소/최대 출력·페어글라스 경계 → 불러오기/저장. PLC에서 값을 직접 읽고 쓴다.</w:t>
+        <w:t>관리자 설정: 과열 상한·상온/2차 냉동기 경계·냉동기 딜레이·바이패스 경계·MFC 최소/최대 출력·페어글라스 경계 → 불러오기/저장. [불러오기]는 PLC 현재값을 읽어 화면에 덮어쓰고, [저장]은 8개 값을 PLC 워드에 즉시 기록한다(설정 파일 저장이 아님).</w:t>
       </w:r>
     </w:p>
     <w:p>
@@ -11698,7 +11698,7 @@
           <w:rFonts w:ascii="맑은 고딕" w:hAnsi="맑은 고딕" w:eastAsia="맑은 고딕"/>
           <w:sz w:val="21"/>
         </w:rPr>
-        <w:t>서보 포인트 좌표(20): 포인트별 X/Y → 불러오기/저장. PLC에서 좌표를 직접 읽고 쓴다.</w:t>
+        <w:t>서보 포인트 좌표(20): 포인트 1~20번의 X/Y → 불러오기/저장. PLC 좌표 워드를 직접 읽고 쓴다. 화면 단위는 mm이며 PLC에는 0.1 mm 정수로 변환된다.</w:t>
       </w:r>
     </w:p>
     <w:p>
@@ -12065,7 +12065,7 @@
           <w:rFonts w:ascii="맑은 고딕" w:hAnsi="맑은 고딕" w:eastAsia="맑은 고딕"/>
           <w:sz w:val="21"/>
         </w:rPr>
-        <w:t>PC당 1개 운영자 세션 콘솔 앱(로그온 예약작업 HCS-Manager)으로 USB 카메라를 WMI로 자동 발견하고, Master에서 승인하면 Agent를 자동 기동·감독한다. 수동 Agent 기동(3.5)과는 택일이다.</w:t>
+        <w:t>PC당 1개 운영자 세션 콘솔 앱(로그온 예약작업 HCS-Manager)으로 USB 카메라를 WMI로 자동 발견한다. 카메라 런타임은 별도 로그온 예약작업(HCS-AgentUI)으로 뜬 AgentUI 프로세스가 소유하며, Manager는 Master의 승인 상태에 따라 NATS로 해당 AgentUI에 카메라 런타임 로드/언로드(runtimeLoad/runtimeUnload) 명령만 보낸다. Manager는 프로세스를 죽이지 않으므로 한 카메라를 거부·비활성해도 나머지 카메라는 유지된다. 수동 Agent 기동(3.5)과는 혼용하지 않는다.</w:t>
       </w:r>
     </w:p>
     <w:p>
@@ -12236,23 +12236,23 @@
                 <w:b w:val="0"/>
                 <w:sz w:val="19"/>
               </w:rPr>
-              <w:t>PCId / NatsUrl / SimulationMode / InstallRoot / AgentExePath</w:t>
-            </w:r>
-          </w:p>
-        </w:tc>
-        <w:tc>
-          <w:tcPr>
-            <w:tcW w:type="dxa" w:w="2880"/>
-          </w:tcPr>
-          <w:p>
-            <w:r/>
-            <w:r>
-              <w:rPr>
-                <w:rFonts w:ascii="맑은 고딕" w:hAnsi="맑은 고딕" w:eastAsia="맑은 고딕"/>
-                <w:b w:val="0"/>
-                <w:sz w:val="19"/>
-              </w:rPr>
-              <w:t>서비스 설정. AgentExePath 경로에 Agent 빌드 필요</w:t>
+              <w:t>PCId / NatsUrl / SimulateEnumeration / SimulateAgentMode / LogRetentionDays / WarnAlertEnabled / InstallRoot / AgentExePath / AgentUiExePath</w:t>
+            </w:r>
+          </w:p>
+        </w:tc>
+        <w:tc>
+          <w:tcPr>
+            <w:tcW w:type="dxa" w:w="2880"/>
+          </w:tcPr>
+          <w:p>
+            <w:r/>
+            <w:r>
+              <w:rPr>
+                <w:rFonts w:ascii="맑은 고딕" w:hAnsi="맑은 고딕" w:eastAsia="맑은 고딕"/>
+                <w:b w:val="0"/>
+                <w:sz w:val="19"/>
+              </w:rPr>
+              <w:t>Manager 시작 설정(4.7 참고). 시작 시 1회 로드</w:t>
             </w:r>
           </w:p>
         </w:tc>
@@ -12286,23 +12286,23 @@
                 <w:b w:val="0"/>
                 <w:sz w:val="19"/>
               </w:rPr>
-              <w:t>Cameras[](HardwareId/AgentId/Alias/IsApproved/IsDisabled)</w:t>
-            </w:r>
-          </w:p>
-        </w:tc>
-        <w:tc>
-          <w:tcPr>
-            <w:tcW w:type="dxa" w:w="2880"/>
-          </w:tcPr>
-          <w:p>
-            <w:r/>
-            <w:r>
-              <w:rPr>
-                <w:rFonts w:ascii="맑은 고딕" w:hAnsi="맑은 고딕" w:eastAsia="맑은 고딕"/>
-                <w:b w:val="0"/>
-                <w:sz w:val="19"/>
-              </w:rPr>
-              <w:t>카메라 등록 상태(직접 편집 금지, Devices 탭에서 관리)</w:t>
+              <w:t>Cameras[](HardwareId/AgentId/Alias/OpenCvIndex/IsApproved/IsDisabled …)</w:t>
+            </w:r>
+          </w:p>
+        </w:tc>
+        <w:tc>
+          <w:tcPr>
+            <w:tcW w:type="dxa" w:w="2880"/>
+          </w:tcPr>
+          <w:p>
+            <w:r/>
+            <w:r>
+              <w:rPr>
+                <w:rFonts w:ascii="맑은 고딕" w:hAnsi="맑은 고딕" w:eastAsia="맑은 고딕"/>
+                <w:b w:val="0"/>
+                <w:sz w:val="19"/>
+              </w:rPr>
+              <w:t>카메라 승인·상태. `ManagerStateStore`가 관리(직접 편집 금지, 장치 관리 화면에서 조작)</w:t>
             </w:r>
           </w:p>
         </w:tc>
@@ -12338,7 +12338,7 @@
           <w:rFonts w:ascii="맑은 고딕" w:hAnsi="맑은 고딕" w:eastAsia="맑은 고딕"/>
           <w:sz w:val="21"/>
         </w:rPr>
-        <w:t>Agent 설정 화면의 디바이스 관리 탭에 미승인(Approved=False)으로 표시</w:t>
+        <w:t>Master의 장치 관리(Devices) 화면에 미승인(IsApproved=False)으로 표시</w:t>
       </w:r>
     </w:p>
     <w:p>
@@ -12362,7 +12362,7 @@
           <w:rFonts w:ascii="맑은 고딕" w:hAnsi="맑은 고딕" w:eastAsia="맑은 고딕"/>
           <w:sz w:val="21"/>
         </w:rPr>
-        <w:t>Manager가 AgentId 부여 + Agent 기동 → 인벤토리 재발행(Approved=True)</w:t>
+        <w:t>Manager가 (필요 시)AgentId 부여, IsApproved=true로 저장하고 AgentUI에 runtimeLoad 전송 → 인벤토리 재발행</w:t>
       </w:r>
     </w:p>
     <w:p>
@@ -12374,7 +12374,7 @@
           <w:rFonts w:ascii="맑은 고딕" w:hAnsi="맑은 고딕" w:eastAsia="맑은 고딕"/>
           <w:sz w:val="21"/>
         </w:rPr>
-        <w:t>대시보드에 초록 점 → 촬영 준비 완료</w:t>
+        <w:t>승인·로드 희망 상태이고 최근 15초 이내 AgentUI 하트비트가 오면 장치 화면에 실행 중(초록)으로 표시</w:t>
       </w:r>
     </w:p>
     <w:tbl>
@@ -12454,7 +12454,7 @@
                 <w:b w:val="0"/>
                 <w:sz w:val="19"/>
               </w:rPr>
-              <w:t>IsApproved=true, Agent 기동(영구드롭 재기동에도 사용)</w:t>
+              <w:t>IsApproved=true·IsDisabled=false 저장 후 AgentUI에 runtimeLoad 전송</w:t>
             </w:r>
           </w:p>
         </w:tc>
@@ -12488,7 +12488,7 @@
                 <w:b w:val="0"/>
                 <w:sz w:val="19"/>
               </w:rPr>
-              <w:t>IsApproved=false + Agent 프로세스 종료</w:t>
+              <w:t>IsApproved=false 저장 후 runtimeUnload 전송(프로세스는 종료하지 않으며 등록은 남아 재승인 가능)</w:t>
             </w:r>
           </w:p>
         </w:tc>
@@ -12556,7 +12556,7 @@
                 <w:b w:val="0"/>
                 <w:sz w:val="19"/>
               </w:rPr>
-              <w:t>승인 카메라에 시리얼 설정 포워딩</w:t>
+              <w:t>승인 카메라에 시리얼 설정 포워딩(적용 ACK 확인 UI는 없음)</w:t>
             </w:r>
           </w:p>
         </w:tc>
@@ -12590,7 +12590,7 @@
                 <w:b w:val="0"/>
                 <w:sz w:val="19"/>
               </w:rPr>
-              <w:t>Agent NDJSON 로그를 gzip으로 요청·표시</w:t>
+              <w:t>Agent 로그를 gzip으로 요청·표시(최대 5MB, 30초 초과 시 응답 없음)</w:t>
             </w:r>
           </w:p>
         </w:tc>
@@ -12621,7 +12621,7 @@
                 <w:color w:val="1F4E79"/>
                 <w:sz w:val="21"/>
               </w:rPr>
-              <w:t>[그림 10] 디바이스 관리 — 승인</w:t>
+              <w:t>[그림 10] 장치 관리(Devices) — 승인</w:t>
             </w:r>
           </w:p>
           <w:p>
@@ -12640,7 +12640,7 @@
                 <w:color w:val="303030"/>
                 <w:sz w:val="19"/>
               </w:rPr>
-              <w:t>Agent 설정 화면의 디바이스 관리 탭(카메라 목록 + 승인/거부 + 시리얼 설정)</w:t>
+              <w:t>Master의 장치 관리(Devices) 화면(카메라 목록 + 승인/거부 + 시리얼 설정)</w:t>
             </w:r>
           </w:p>
           <w:p>
@@ -12730,7 +12730,7 @@
                 <w:color w:val="303030"/>
                 <w:sz w:val="19"/>
               </w:rPr>
-              <w:t>Agent 프로세스가 반복 크래시하면 지수 백오프(1→2→5→15→60초)로 재시작하고 5회 초과 시 영구 드롭(IsDisabled=true)된다. 원인 해결 후 다시 '승인'하면 재기동된다.</w:t>
+              <w:t>Manager·AgentUI 프로세스가 실패하면 각자의 로그온 예약작업(HCS-Manager·HCS-AgentUI)이 1분 간격으로 최대 3회 재시작한다. 카메라별 지수 백오프나 영구 드롭 로직은 없다. 비활성(IsDisabled) 카메라는 다시 '승인'하면 runtimeLoad가 재전송된다.</w:t>
             </w:r>
           </w:p>
         </w:tc>
@@ -14271,6 +14271,15 @@
     </w:tbl>
     <w:p/>
     <w:p>
+      <w:r>
+        <w:rPr>
+          <w:rFonts w:ascii="맑은 고딕" w:hAnsi="맑은 고딕" w:eastAsia="맑은 고딕"/>
+          <w:sz w:val="21"/>
+        </w:rPr>
+        <w:t>백업 후 대상 폴더에 data_*.db와 recipe_* 폴더가 생성됐는지, 파일 크기와 수정 시각이 정상인지 확인한다.</w:t>
+      </w:r>
+    </w:p>
+    <w:p>
       <w:pPr>
         <w:pStyle w:val="Heading2"/>
       </w:pPr>
@@ -14365,6 +14374,15 @@
     </w:tbl>
     <w:p/>
     <w:p>
+      <w:r>
+        <w:rPr>
+          <w:rFonts w:ascii="맑은 고딕" w:hAnsi="맑은 고딕" w:eastAsia="맑은 고딕"/>
+          <w:sz w:val="21"/>
+        </w:rPr>
+        <w:t>레시피를 복원하려면 Master 종료 상태에서 백업한 recipe_* 폴더의 *.json을 %LOCALAPPDATA%\HeatingCameraSystem\recipe\로 복사한다.</w:t>
+      </w:r>
+    </w:p>
+    <w:p>
       <w:pPr>
         <w:pStyle w:val="Heading2"/>
       </w:pPr>
@@ -15425,7 +15443,7 @@
                 <w:b w:val="0"/>
                 <w:sz w:val="19"/>
               </w:rPr>
-              <w:t>Manager 설정</w:t>
+              <w:t>Manager 설정. 시작 시 1회 로드, 누락 시 메모리 기본값 사용(자동 저장 안 함)</w:t>
             </w:r>
           </w:p>
         </w:tc>
@@ -15475,7 +15493,7 @@
                 <w:b w:val="0"/>
                 <w:sz w:val="19"/>
               </w:rPr>
-              <w:t>Manager 상태</w:t>
+              <w:t>Manager 카메라 승인·상태. `ManagerStateStore`가 생성·갱신(직접 편집 금지)</w:t>
             </w:r>
           </w:p>
         </w:tc>
@@ -15493,39 +15511,239 @@
                 <w:b w:val="0"/>
                 <w:sz w:val="19"/>
               </w:rPr>
-              <w:t>Agent 로그</w:t>
-            </w:r>
-          </w:p>
-        </w:tc>
-        <w:tc>
-          <w:tcPr>
-            <w:tcW w:type="dxa" w:w="2880"/>
-          </w:tcPr>
-          <w:p>
-            <w:r/>
-            <w:r>
-              <w:rPr>
-                <w:rFonts w:ascii="맑은 고딕" w:hAnsi="맑은 고딕" w:eastAsia="맑은 고딕"/>
-                <w:b w:val="0"/>
-                <w:sz w:val="19"/>
-              </w:rPr>
-              <w:t>C:\HeatingCameraSystem\logs\{AgentId}\</w:t>
-            </w:r>
-          </w:p>
-        </w:tc>
-        <w:tc>
-          <w:tcPr>
-            <w:tcW w:type="dxa" w:w="2880"/>
-          </w:tcPr>
-          <w:p>
-            <w:r/>
-            <w:r>
-              <w:rPr>
-                <w:rFonts w:ascii="맑은 고딕" w:hAnsi="맑은 고딕" w:eastAsia="맑은 고딕"/>
-                <w:b w:val="0"/>
-                <w:sz w:val="19"/>
-              </w:rPr>
-              <w:t>NDJSON, 7일 보관</w:t>
+              <w:t>agentui.json</w:t>
+            </w:r>
+          </w:p>
+        </w:tc>
+        <w:tc>
+          <w:tcPr>
+            <w:tcW w:type="dxa" w:w="2880"/>
+          </w:tcPr>
+          <w:p>
+            <w:r/>
+            <w:r>
+              <w:rPr>
+                <w:rFonts w:ascii="맑은 고딕" w:hAnsi="맑은 고딕" w:eastAsia="맑은 고딕"/>
+                <w:b w:val="0"/>
+                <w:sz w:val="19"/>
+              </w:rPr>
+              <w:t>`%LOCALAPPDATA%\HeatingCameraSystem\AgentUI\`</w:t>
+            </w:r>
+          </w:p>
+        </w:tc>
+        <w:tc>
+          <w:tcPr>
+            <w:tcW w:type="dxa" w:w="2880"/>
+          </w:tcPr>
+          <w:p>
+            <w:r/>
+            <w:r>
+              <w:rPr>
+                <w:rFonts w:ascii="맑은 고딕" w:hAnsi="맑은 고딕" w:eastAsia="맑은 고딕"/>
+                <w:b w:val="0"/>
+                <w:sz w:val="19"/>
+              </w:rPr>
+              <w:t>AgentUI 설정. 누락·읽기 실패 시 생성</w:t>
+            </w:r>
+          </w:p>
+        </w:tc>
+      </w:tr>
+      <w:tr>
+        <w:tc>
+          <w:tcPr>
+            <w:tcW w:type="dxa" w:w="2880"/>
+          </w:tcPr>
+          <w:p>
+            <w:r/>
+            <w:r>
+              <w:rPr>
+                <w:rFonts w:ascii="맑은 고딕" w:hAnsi="맑은 고딕" w:eastAsia="맑은 고딕"/>
+                <w:b w:val="0"/>
+                <w:sz w:val="19"/>
+              </w:rPr>
+              <w:t>AgentUI 캡처</w:t>
+            </w:r>
+          </w:p>
+        </w:tc>
+        <w:tc>
+          <w:tcPr>
+            <w:tcW w:type="dxa" w:w="2880"/>
+          </w:tcPr>
+          <w:p>
+            <w:r/>
+            <w:r>
+              <w:rPr>
+                <w:rFonts w:ascii="맑은 고딕" w:hAnsi="맑은 고딕" w:eastAsia="맑은 고딕"/>
+                <w:b w:val="0"/>
+                <w:sz w:val="19"/>
+              </w:rPr>
+              <w:t>`%LOCALAPPDATA%\HeatingCameraSystem\AgentUI\Captures\`</w:t>
+            </w:r>
+          </w:p>
+        </w:tc>
+        <w:tc>
+          <w:tcPr>
+            <w:tcW w:type="dxa" w:w="2880"/>
+          </w:tcPr>
+          <w:p>
+            <w:r/>
+            <w:r>
+              <w:rPr>
+                <w:rFonts w:ascii="맑은 고딕" w:hAnsi="맑은 고딕" w:eastAsia="맑은 고딕"/>
+                <w:b w:val="0"/>
+                <w:sz w:val="19"/>
+              </w:rPr>
+              <w:t>AgentUI 기본 캡처 폴더</w:t>
+            </w:r>
+          </w:p>
+        </w:tc>
+      </w:tr>
+      <w:tr>
+        <w:tc>
+          <w:tcPr>
+            <w:tcW w:type="dxa" w:w="2880"/>
+          </w:tcPr>
+          <w:p>
+            <w:r/>
+            <w:r>
+              <w:rPr>
+                <w:rFonts w:ascii="맑은 고딕" w:hAnsi="맑은 고딕" w:eastAsia="맑은 고딕"/>
+                <w:b w:val="0"/>
+                <w:sz w:val="19"/>
+              </w:rPr>
+              <w:t>콘솔 Agent 로그</w:t>
+            </w:r>
+          </w:p>
+        </w:tc>
+        <w:tc>
+          <w:tcPr>
+            <w:tcW w:type="dxa" w:w="2880"/>
+          </w:tcPr>
+          <w:p>
+            <w:r/>
+            <w:r>
+              <w:rPr>
+                <w:rFonts w:ascii="맑은 고딕" w:hAnsi="맑은 고딕" w:eastAsia="맑은 고딕"/>
+                <w:b w:val="0"/>
+                <w:sz w:val="19"/>
+              </w:rPr>
+              <w:t>`&lt;Agent exe&gt;\logs\agent-YYYYMMDD.log`</w:t>
+            </w:r>
+          </w:p>
+        </w:tc>
+        <w:tc>
+          <w:tcPr>
+            <w:tcW w:type="dxa" w:w="2880"/>
+          </w:tcPr>
+          <w:p>
+            <w:r/>
+            <w:r>
+              <w:rPr>
+                <w:rFonts w:ascii="맑은 고딕" w:hAnsi="맑은 고딕" w:eastAsia="맑은 고딕"/>
+                <w:b w:val="0"/>
+                <w:sz w:val="19"/>
+              </w:rPr>
+              <w:t>한 줄 JSON(CLEF) 일별 롤링, 최근 7개 파일 보존(`LogPath`로 변경 가능)</w:t>
+            </w:r>
+          </w:p>
+        </w:tc>
+      </w:tr>
+      <w:tr>
+        <w:tc>
+          <w:tcPr>
+            <w:tcW w:type="dxa" w:w="2880"/>
+          </w:tcPr>
+          <w:p>
+            <w:r/>
+            <w:r>
+              <w:rPr>
+                <w:rFonts w:ascii="맑은 고딕" w:hAnsi="맑은 고딕" w:eastAsia="맑은 고딕"/>
+                <w:b w:val="0"/>
+                <w:sz w:val="19"/>
+              </w:rPr>
+              <w:t>AgentUI 로그</w:t>
+            </w:r>
+          </w:p>
+        </w:tc>
+        <w:tc>
+          <w:tcPr>
+            <w:tcW w:type="dxa" w:w="2880"/>
+          </w:tcPr>
+          <w:p>
+            <w:r/>
+            <w:r>
+              <w:rPr>
+                <w:rFonts w:ascii="맑은 고딕" w:hAnsi="맑은 고딕" w:eastAsia="맑은 고딕"/>
+                <w:b w:val="0"/>
+                <w:sz w:val="19"/>
+              </w:rPr>
+              <w:t>`%LOCALAPPDATA%\HeatingCameraSystem\AgentUI\logs\agentui-YYYYMMDD.ndjson`</w:t>
+            </w:r>
+          </w:p>
+        </w:tc>
+        <w:tc>
+          <w:tcPr>
+            <w:tcW w:type="dxa" w:w="2880"/>
+          </w:tcPr>
+          <w:p>
+            <w:r/>
+            <w:r>
+              <w:rPr>
+                <w:rFonts w:ascii="맑은 고딕" w:hAnsi="맑은 고딕" w:eastAsia="맑은 고딕"/>
+                <w:b w:val="0"/>
+                <w:sz w:val="19"/>
+              </w:rPr>
+              <w:t>CLEF NDJSON 일별 롤링, 최근 14개 파일 보존</w:t>
+            </w:r>
+          </w:p>
+        </w:tc>
+      </w:tr>
+      <w:tr>
+        <w:tc>
+          <w:tcPr>
+            <w:tcW w:type="dxa" w:w="2880"/>
+          </w:tcPr>
+          <w:p>
+            <w:r/>
+            <w:r>
+              <w:rPr>
+                <w:rFonts w:ascii="맑은 고딕" w:hAnsi="맑은 고딕" w:eastAsia="맑은 고딕"/>
+                <w:b w:val="0"/>
+                <w:sz w:val="19"/>
+              </w:rPr>
+              <w:t>AgentManager 감시 로그</w:t>
+            </w:r>
+          </w:p>
+        </w:tc>
+        <w:tc>
+          <w:tcPr>
+            <w:tcW w:type="dxa" w:w="2880"/>
+          </w:tcPr>
+          <w:p>
+            <w:r/>
+            <w:r>
+              <w:rPr>
+                <w:rFonts w:ascii="맑은 고딕" w:hAnsi="맑은 고딕" w:eastAsia="맑은 고딕"/>
+                <w:b w:val="0"/>
+                <w:sz w:val="19"/>
+              </w:rPr>
+              <w:t>`&lt;InstallRoot&gt;\logs\{AgentId}\`</w:t>
+            </w:r>
+          </w:p>
+        </w:tc>
+        <w:tc>
+          <w:tcPr>
+            <w:tcW w:type="dxa" w:w="2880"/>
+          </w:tcPr>
+          <w:p>
+            <w:r/>
+            <w:r>
+              <w:rPr>
+                <w:rFonts w:ascii="맑은 고딕" w:hAnsi="맑은 고딕" w:eastAsia="맑은 고딕"/>
+                <w:b w:val="0"/>
+                <w:sz w:val="19"/>
+              </w:rPr>
+              <w:t>Manager가 수집하는 Agent 로그 경로(배포 시 Agent `LogPath`와 일치)</w:t>
             </w:r>
           </w:p>
         </w:tc>

</xml_diff>